<commit_message>
Update author name to pen name Tripp Wire
Replaced Travis Tippetts with pen name Tripp Wire
throughout both the markdown manuscript and KDP Word document.

Co-Authored-By: Claude Sonnet 4.6 <noreply@anthropic.com>
</commit_message>
<xml_diff>
--- a/UNDER THE SKIN — KDP Manuscript.docx
+++ b/UNDER THE SKIN — KDP Manuscript.docx
@@ -58,7 +58,7 @@
           <w:i w:val="0"/>
           <w:sz w:val="28"/>
         </w:rPr>
-        <w:t>Travis Tippetts</w:t>
+        <w:t>Tripp Wire</w:t>
       </w:r>
     </w:p>
     <w:p>
@@ -110,7 +110,7 @@
           <w:i w:val="0"/>
           <w:sz w:val="22"/>
         </w:rPr>
-        <w:t>Copyright © 2026 Travis Tippetts</w:t>
+        <w:t>Copyright © 2026 Tripp Wire</w:t>
       </w:r>
     </w:p>
     <w:p>
@@ -11512,7 +11512,7 @@
           <w:i/>
           <w:sz w:val="22"/>
         </w:rPr>
-        <w:t>Travis Tippetts, 2026</w:t>
+        <w:t>Tripp Wire, 2026</w:t>
       </w:r>
     </w:p>
     <w:sectPr>

</xml_diff>